<commit_message>
feat: integrate grade 5 week 03 full set
</commit_message>
<xml_diff>
--- a/materyaller/5-sinif/hafta03/evraklar/01-dijital-kimlik-kartim.docx
+++ b/materyaller/5-sinif/hafta03/evraklar/01-dijital-kimlik-kartim.docx
@@ -4,678 +4,77 @@
   <w:body>
     <w:p>
       <w:pPr>
-        <w:widowControl/>
         <w:spacing w:after="40"/>
+        <w:jc w:val="left"/>
       </w:pPr>
       <w:r>
         <w:rPr>
           <w:rFonts w:ascii="Arial" w:hAnsi="Arial" w:eastAsia="Arial"/>
           <w:b/>
-          <w:color w:val="12182B"/>
-          <w:sz w:val="38"/>
+          <w:color w:val="0E1B2E"/>
+          <w:sz w:val="40"/>
         </w:rPr>
         <w:t>Dijital Kimlik Kartım</w:t>
       </w:r>
     </w:p>
     <w:p>
       <w:pPr>
-        <w:widowControl/>
-        <w:spacing w:after="140"/>
+        <w:spacing w:after="160"/>
       </w:pPr>
       <w:r>
         <w:rPr>
           <w:rFonts w:ascii="Arial" w:hAnsi="Arial" w:eastAsia="Arial"/>
           <w:b w:val="0"/>
-          <w:color w:val="565F70"/>
+          <w:color w:val="667085"/>
           <w:sz w:val="19"/>
         </w:rPr>
-        <w:t>Gerçek kişisel bilgilerini kullanmadan, hayali ve güvenli bir dijital kimlik oluştur.</w:t>
+        <w:t>Öğrenci çalışma kâğıdı • BTY.5.1.3</w:t>
       </w:r>
     </w:p>
     <w:tbl>
       <w:tblPr>
         <w:tblW w:type="auto" w:w="0"/>
-        <w:jc w:val="center"/>
+        <w:jc w:val="left"/>
         <w:tblLayout w:type="fixed"/>
         <w:tblLook w:firstColumn="1" w:firstRow="1" w:lastColumn="0" w:lastRow="0" w:noHBand="0" w:noVBand="1" w:val="04A0"/>
       </w:tblPr>
       <w:tblGrid>
-        <w:gridCol w:w="3459"/>
-        <w:gridCol w:w="3459"/>
-        <w:gridCol w:w="3459"/>
+        <w:gridCol w:w="1701"/>
+        <w:gridCol w:w="8391"/>
       </w:tblGrid>
       <w:tr>
         <w:tc>
           <w:tcPr>
-            <w:tcW w:type="dxa" w:w="2628000"/>
-            <w:tcMar>
-              <w:top w:w="40" w:type="dxa"/>
-              <w:start w:w="0" w:type="dxa"/>
-              <w:bottom w:w="70" w:type="dxa"/>
-              <w:end w:w="60" w:type="dxa"/>
-            </w:tcMar>
-            <w:tcBorders>
-              <w:bottom w:val="single" w:sz="6" w:color="DCE1DE"/>
-            </w:tcBorders>
+            <w:tcW w:type="dxa" w:w="5188"/>
+            <w:shd w:fill="8F2332"/>
           </w:tcPr>
           <w:p>
-            <w:pPr>
-              <w:spacing w:after="20"/>
-            </w:pPr>
-            <w:r>
-              <w:rPr>
-                <w:rFonts w:ascii="Arial" w:hAnsi="Arial" w:eastAsia="Arial"/>
-                <w:b/>
-                <w:color w:val="565F70"/>
-                <w:sz w:val="17"/>
-              </w:rPr>
-              <w:t>Ad Soyad:</w:t>
-            </w:r>
-            <w:r>
-              <w:rPr>
-                <w:rFonts w:ascii="Arial" w:hAnsi="Arial" w:eastAsia="Arial"/>
-                <w:b w:val="0"/>
-                <w:color w:val="565F70"/>
-                <w:sz w:val="17"/>
-              </w:rPr>
-              <w:t xml:space="preserve">  __________________</w:t>
-            </w:r>
+            <w:r/>
           </w:p>
         </w:tc>
         <w:tc>
           <w:tcPr>
-            <w:tcW w:type="dxa" w:w="1872000"/>
-            <w:tcMar>
-              <w:top w:w="40" w:type="dxa"/>
-              <w:start w:w="0" w:type="dxa"/>
-              <w:bottom w:w="70" w:type="dxa"/>
-              <w:end w:w="60" w:type="dxa"/>
-            </w:tcMar>
-            <w:tcBorders>
-              <w:bottom w:val="single" w:sz="6" w:color="DCE1DE"/>
-            </w:tcBorders>
+            <w:tcW w:type="dxa" w:w="5188"/>
+            <w:shd w:fill="FFFFFF"/>
           </w:tcPr>
           <w:p>
-            <w:pPr>
-              <w:spacing w:after="20"/>
-            </w:pPr>
-            <w:r>
-              <w:rPr>
-                <w:rFonts w:ascii="Arial" w:hAnsi="Arial" w:eastAsia="Arial"/>
-                <w:b/>
-                <w:color w:val="565F70"/>
-                <w:sz w:val="17"/>
-              </w:rPr>
-              <w:t>Sınıf:</w:t>
-            </w:r>
-            <w:r>
-              <w:rPr>
-                <w:rFonts w:ascii="Arial" w:hAnsi="Arial" w:eastAsia="Arial"/>
-                <w:b w:val="0"/>
-                <w:color w:val="565F70"/>
-                <w:sz w:val="17"/>
-              </w:rPr>
-              <w:t xml:space="preserve">  _________</w:t>
-            </w:r>
-          </w:p>
-        </w:tc>
-        <w:tc>
-          <w:tcPr>
-            <w:tcW w:type="dxa" w:w="1872000"/>
-            <w:tcMar>
-              <w:top w:w="40" w:type="dxa"/>
-              <w:start w:w="0" w:type="dxa"/>
-              <w:bottom w:w="70" w:type="dxa"/>
-              <w:end w:w="60" w:type="dxa"/>
-            </w:tcMar>
-            <w:tcBorders>
-              <w:bottom w:val="single" w:sz="6" w:color="DCE1DE"/>
-            </w:tcBorders>
-          </w:tcPr>
-          <w:p>
-            <w:pPr>
-              <w:spacing w:after="20"/>
-            </w:pPr>
-            <w:r>
-              <w:rPr>
-                <w:rFonts w:ascii="Arial" w:hAnsi="Arial" w:eastAsia="Arial"/>
-                <w:b/>
-                <w:color w:val="565F70"/>
-                <w:sz w:val="17"/>
-              </w:rPr>
-              <w:t>Tarih:</w:t>
-            </w:r>
-            <w:r>
-              <w:rPr>
-                <w:rFonts w:ascii="Arial" w:hAnsi="Arial" w:eastAsia="Arial"/>
-                <w:b w:val="0"/>
-                <w:color w:val="565F70"/>
-                <w:sz w:val="17"/>
-              </w:rPr>
-              <w:t xml:space="preserve">  _________</w:t>
-            </w:r>
+            <w:r/>
           </w:p>
         </w:tc>
       </w:tr>
     </w:tbl>
-    <w:p>
-      <w:pPr>
-        <w:widowControl/>
-        <w:spacing w:after="60" w:before="0"/>
-      </w:pPr>
-    </w:p>
     <w:tbl>
       <w:tblPr>
         <w:tblW w:type="auto" w:w="0"/>
-        <w:jc w:val="center"/>
-        <w:tblLayout w:type="fixed"/>
         <w:tblLook w:firstColumn="1" w:firstRow="1" w:lastColumn="0" w:lastRow="0" w:noHBand="0" w:noVBand="1" w:val="04A0"/>
-      </w:tblPr>
-      <w:tblGrid>
-        <w:gridCol w:w="5188"/>
-        <w:gridCol w:w="5188"/>
-      </w:tblGrid>
-      <w:tr>
-        <w:tc>
-          <w:tcPr>
-            <w:tcW w:type="dxa" w:w="2556000"/>
-            <w:tcBorders>
-              <w:top w:val="single" w:sz="7" w:color="DCE1DE"/>
-              <w:bottom w:val="single" w:sz="7" w:color="DCE1DE"/>
-              <w:start w:val="single" w:sz="7" w:color="DCE1DE"/>
-              <w:end w:val="single" w:sz="7" w:color="DCE1DE"/>
-            </w:tcBorders>
-            <w:vAlign w:val="top"/>
-            <w:shd w:fill="FAF4F3"/>
-            <w:tcMar>
-              <w:top w:w="100" w:type="dxa"/>
-              <w:start w:w="120" w:type="dxa"/>
-              <w:bottom w:w="100" w:type="dxa"/>
-              <w:end w:w="120" w:type="dxa"/>
-            </w:tcMar>
-          </w:tcPr>
-          <w:p>
-            <w:pPr>
-              <w:spacing w:after="40"/>
-              <w:jc w:val="center"/>
-            </w:pPr>
-            <w:r/>
-            <w:r>
-              <w:rPr>
-                <w:rFonts w:ascii="Arial" w:hAnsi="Arial" w:eastAsia="Arial"/>
-                <w:b/>
-                <w:color w:val="8B1E24"/>
-                <w:sz w:val="24"/>
-              </w:rPr>
-              <w:t>AVATARIM</w:t>
-            </w:r>
-          </w:p>
-          <w:p>
-            <w:pPr>
-              <w:spacing w:after="140"/>
-              <w:jc w:val="center"/>
-            </w:pPr>
-            <w:r>
-              <w:rPr>
-                <w:rFonts w:ascii="Arial" w:hAnsi="Arial" w:eastAsia="Arial"/>
-                <w:b w:val="0"/>
-                <w:color w:val="565F70"/>
-                <w:sz w:val="17"/>
-              </w:rPr>
-              <w:t>Bu alana hayali bir avatar çiz.</w:t>
-            </w:r>
-          </w:p>
-          <w:tbl>
-            <w:tblPr>
-              <w:tblW w:type="auto" w:w="0"/>
-              <w:jc w:val="center"/>
-              <w:tblLayout w:type="fixed"/>
-              <w:tblLook w:firstColumn="1" w:firstRow="1" w:lastColumn="0" w:lastRow="0" w:noHBand="0" w:noVBand="1" w:val="04A0"/>
-            </w:tblPr>
-            <w:tblGrid>
-              <w:gridCol w:w="2556000"/>
-            </w:tblGrid>
-            <w:tr>
-              <w:trPr>
-                <w:trHeight w:val="5216" w:hRule="exact"/>
-              </w:trPr>
-              <w:tc>
-                <w:tcPr>
-                  <w:tcW w:type="dxa" w:w="2088000"/>
-                  <w:shd w:fill="FFFFFF"/>
-                  <w:tcMar>
-                    <w:top w:w="20" w:type="dxa"/>
-                    <w:start w:w="20" w:type="dxa"/>
-                    <w:bottom w:w="20" w:type="dxa"/>
-                    <w:end w:w="20" w:type="dxa"/>
-                  </w:tcMar>
-                  <w:tcBorders>
-                    <w:top w:val="dashed" w:sz="8" w:color="A3ACB9"/>
-                    <w:bottom w:val="dashed" w:sz="8" w:color="A3ACB9"/>
-                    <w:start w:val="dashed" w:sz="8" w:color="A3ACB9"/>
-                    <w:end w:val="dashed" w:sz="8" w:color="A3ACB9"/>
-                  </w:tcBorders>
-                </w:tcPr>
-                <w:p>
-                  <w:pPr>
-                    <w:spacing w:before="2154"/>
-                    <w:jc w:val="center"/>
-                  </w:pPr>
-                  <w:r>
-                    <w:rPr>
-                      <w:rFonts w:ascii="Arial" w:hAnsi="Arial" w:eastAsia="Arial"/>
-                      <w:b w:val="0"/>
-                      <w:color w:val="A3ACB9"/>
-                      <w:sz w:val="18"/>
-                    </w:rPr>
-                    <w:t>Çizim alanı</w:t>
-                  </w:r>
-                </w:p>
-              </w:tc>
-            </w:tr>
-          </w:tbl>
-          <w:p/>
-          <w:p>
-            <w:pPr>
-              <w:spacing w:before="100" w:after="0"/>
-              <w:jc w:val="center"/>
-            </w:pPr>
-            <w:r>
-              <w:rPr>
-                <w:rFonts w:ascii="Arial" w:hAnsi="Arial" w:eastAsia="Arial"/>
-                <w:b w:val="0"/>
-                <w:color w:val="565F70"/>
-                <w:sz w:val="15"/>
-              </w:rPr>
-              <w:t>Gerçek fotoğrafını kullanmak zorunda değilsin.</w:t>
-            </w:r>
-          </w:p>
-        </w:tc>
-        <w:tc>
-          <w:tcPr>
-            <w:tcW w:type="dxa" w:w="3816000"/>
-            <w:tcBorders>
-              <w:top w:val="single" w:sz="7" w:color="DCE1DE"/>
-              <w:bottom w:val="single" w:sz="7" w:color="DCE1DE"/>
-              <w:start w:val="single" w:sz="7" w:color="DCE1DE"/>
-              <w:end w:val="single" w:sz="7" w:color="DCE1DE"/>
-            </w:tcBorders>
-            <w:vAlign w:val="top"/>
-            <w:tcMar>
-              <w:top w:w="35" w:type="dxa"/>
-              <w:start w:w="100" w:type="dxa"/>
-              <w:bottom w:w="35" w:type="dxa"/>
-              <w:end w:w="100" w:type="dxa"/>
-            </w:tcMar>
-          </w:tcPr>
-          <w:p>
-            <w:r/>
-          </w:p>
-          <w:tbl>
-            <w:tblPr>
-              <w:tblW w:type="auto" w:w="0"/>
-              <w:jc w:val="center"/>
-              <w:tblLayout w:type="fixed"/>
-              <w:tblLook w:firstColumn="1" w:firstRow="1" w:lastColumn="0" w:lastRow="0" w:noHBand="0" w:noVBand="1" w:val="04A0"/>
-            </w:tblPr>
-            <w:tblGrid>
-              <w:gridCol w:w="3816000"/>
-            </w:tblGrid>
-            <w:tr>
-              <w:trPr>
-                <w:trHeight w:val="1049" w:hRule="exact"/>
-              </w:trPr>
-              <w:tc>
-                <w:tcPr>
-                  <w:tcW w:type="dxa" w:w="3600000"/>
-                  <w:tcMar>
-                    <w:top w:w="75" w:type="dxa"/>
-                    <w:start w:w="95" w:type="dxa"/>
-                    <w:bottom w:w="55" w:type="dxa"/>
-                    <w:end w:w="95" w:type="dxa"/>
-                  </w:tcMar>
-                  <w:tcBorders>
-                    <w:bottom w:val="single" w:sz="6" w:color="DCE1DE"/>
-                  </w:tcBorders>
-                </w:tcPr>
-                <w:p>
-                  <w:pPr>
-                    <w:keepNext/>
-                    <w:spacing w:after="20"/>
-                  </w:pPr>
-                  <w:r>
-                    <w:rPr>
-                      <w:rFonts w:ascii="Arial" w:hAnsi="Arial" w:eastAsia="Arial"/>
-                      <w:b/>
-                      <w:color w:val="12182B"/>
-                      <w:sz w:val="19"/>
-                    </w:rPr>
-                    <w:t>1. Kullanıcı adım:</w:t>
-                  </w:r>
-                </w:p>
-                <w:p>
-                  <w:pPr>
-                    <w:spacing w:after="40"/>
-                  </w:pPr>
-                  <w:r>
-                    <w:rPr>
-                      <w:rFonts w:ascii="Arial" w:hAnsi="Arial" w:eastAsia="Arial"/>
-                      <w:b w:val="0"/>
-                      <w:color w:val="565F70"/>
-                      <w:sz w:val="14"/>
-                    </w:rPr>
-                    <w:t>Hayali veya anonim bir kullanıcı adı seçebilirsin.</w:t>
-                  </w:r>
-                </w:p>
-                <w:p>
-                  <w:pPr>
-                    <w:spacing w:before="20" w:after="0"/>
-                  </w:pPr>
-                  <w:r>
-                    <w:rPr>
-                      <w:rFonts w:ascii="Arial" w:hAnsi="Arial" w:eastAsia="Arial"/>
-                      <w:b w:val="0"/>
-                      <w:color w:val="565F70"/>
-                      <w:sz w:val="18"/>
-                    </w:rPr>
-                    <w:t>________________________________________________________</w:t>
-                  </w:r>
-                </w:p>
-              </w:tc>
-            </w:tr>
-            <w:tr>
-              <w:trPr>
-                <w:trHeight w:val="1446" w:hRule="exact"/>
-              </w:trPr>
-              <w:tc>
-                <w:tcPr>
-                  <w:tcW w:type="dxa" w:w="3816000"/>
-                  <w:tcMar>
-                    <w:top w:w="75" w:type="dxa"/>
-                    <w:start w:w="95" w:type="dxa"/>
-                    <w:bottom w:w="55" w:type="dxa"/>
-                    <w:end w:w="95" w:type="dxa"/>
-                  </w:tcMar>
-                  <w:tcBorders>
-                    <w:bottom w:val="single" w:sz="6" w:color="DCE1DE"/>
-                  </w:tcBorders>
-                </w:tcPr>
-                <w:p>
-                  <w:pPr>
-                    <w:keepNext/>
-                    <w:spacing w:after="20"/>
-                  </w:pPr>
-                  <w:r>
-                    <w:rPr>
-                      <w:rFonts w:ascii="Arial" w:hAnsi="Arial" w:eastAsia="Arial"/>
-                      <w:b/>
-                      <w:color w:val="12182B"/>
-                      <w:sz w:val="19"/>
-                    </w:rPr>
-                    <w:t>2. Profilimde bulunabilecek bilgiler:</w:t>
-                  </w:r>
-                </w:p>
-                <w:p>
-                  <w:pPr>
-                    <w:spacing w:after="40"/>
-                  </w:pPr>
-                  <w:r>
-                    <w:rPr>
-                      <w:rFonts w:ascii="Arial" w:hAnsi="Arial" w:eastAsia="Arial"/>
-                      <w:b w:val="0"/>
-                      <w:color w:val="565F70"/>
-                      <w:sz w:val="14"/>
-                    </w:rPr>
-                    <w:t>Kişisel ve özel bilgileri yazma.</w:t>
-                  </w:r>
-                </w:p>
-                <w:p>
-                  <w:pPr>
-                    <w:spacing w:before="20" w:after="0"/>
-                  </w:pPr>
-                  <w:r>
-                    <w:rPr>
-                      <w:rFonts w:ascii="Arial" w:hAnsi="Arial" w:eastAsia="Arial"/>
-                      <w:b w:val="0"/>
-                      <w:color w:val="565F70"/>
-                      <w:sz w:val="18"/>
-                    </w:rPr>
-                    <w:t>________________________________________________________</w:t>
-                  </w:r>
-                </w:p>
-                <w:p>
-                  <w:pPr>
-                    <w:spacing w:before="20" w:after="0"/>
-                  </w:pPr>
-                  <w:r>
-                    <w:rPr>
-                      <w:rFonts w:ascii="Arial" w:hAnsi="Arial" w:eastAsia="Arial"/>
-                      <w:b w:val="0"/>
-                      <w:color w:val="565F70"/>
-                      <w:sz w:val="18"/>
-                    </w:rPr>
-                    <w:t>________________________________________________________</w:t>
-                  </w:r>
-                </w:p>
-              </w:tc>
-            </w:tr>
-            <w:tr>
-              <w:trPr>
-                <w:trHeight w:val="1049" w:hRule="exact"/>
-              </w:trPr>
-              <w:tc>
-                <w:tcPr>
-                  <w:tcW w:type="dxa" w:w="3816000"/>
-                  <w:tcMar>
-                    <w:top w:w="75" w:type="dxa"/>
-                    <w:start w:w="95" w:type="dxa"/>
-                    <w:bottom w:w="55" w:type="dxa"/>
-                    <w:end w:w="95" w:type="dxa"/>
-                  </w:tcMar>
-                  <w:tcBorders>
-                    <w:bottom w:val="single" w:sz="6" w:color="DCE1DE"/>
-                  </w:tcBorders>
-                </w:tcPr>
-                <w:p>
-                  <w:pPr>
-                    <w:keepNext/>
-                    <w:spacing w:after="20"/>
-                  </w:pPr>
-                  <w:r>
-                    <w:rPr>
-                      <w:rFonts w:ascii="Arial" w:hAnsi="Arial" w:eastAsia="Arial"/>
-                      <w:b/>
-                      <w:color w:val="12182B"/>
-                      <w:sz w:val="19"/>
-                    </w:rPr>
-                    <w:t>3. Gizlilik tercihim:</w:t>
-                  </w:r>
-                </w:p>
-                <w:p>
-                  <w:pPr>
-                    <w:spacing w:after="40"/>
-                  </w:pPr>
-                  <w:r>
-                    <w:rPr>
-                      <w:rFonts w:ascii="Arial" w:hAnsi="Arial" w:eastAsia="Arial"/>
-                      <w:b w:val="0"/>
-                      <w:color w:val="565F70"/>
-                      <w:sz w:val="14"/>
-                    </w:rPr>
-                    <w:t>Kimlerin görebileceğini nasıl sınırlandıracağını düşün.</w:t>
-                  </w:r>
-                </w:p>
-                <w:p>
-                  <w:pPr>
-                    <w:spacing w:before="20" w:after="0"/>
-                  </w:pPr>
-                  <w:r>
-                    <w:rPr>
-                      <w:rFonts w:ascii="Arial" w:hAnsi="Arial" w:eastAsia="Arial"/>
-                      <w:b w:val="0"/>
-                      <w:color w:val="565F70"/>
-                      <w:sz w:val="18"/>
-                    </w:rPr>
-                    <w:t>________________________________________________________</w:t>
-                  </w:r>
-                </w:p>
-              </w:tc>
-            </w:tr>
-            <w:tr>
-              <w:trPr>
-                <w:trHeight w:val="1446" w:hRule="exact"/>
-              </w:trPr>
-              <w:tc>
-                <w:tcPr>
-                  <w:tcW w:type="dxa" w:w="3816000"/>
-                  <w:tcMar>
-                    <w:top w:w="75" w:type="dxa"/>
-                    <w:start w:w="95" w:type="dxa"/>
-                    <w:bottom w:w="55" w:type="dxa"/>
-                    <w:end w:w="95" w:type="dxa"/>
-                  </w:tcMar>
-                  <w:tcBorders>
-                    <w:bottom w:val="single" w:sz="6" w:color="DCE1DE"/>
-                  </w:tcBorders>
-                </w:tcPr>
-                <w:p>
-                  <w:pPr>
-                    <w:keepNext/>
-                    <w:spacing w:after="20"/>
-                  </w:pPr>
-                  <w:r>
-                    <w:rPr>
-                      <w:rFonts w:ascii="Arial" w:hAnsi="Arial" w:eastAsia="Arial"/>
-                      <w:b/>
-                      <w:color w:val="12182B"/>
-                      <w:sz w:val="19"/>
-                    </w:rPr>
-                    <w:t>4. Çevrim içi davranış kuralım:</w:t>
-                  </w:r>
-                </w:p>
-                <w:p>
-                  <w:pPr>
-                    <w:spacing w:after="40"/>
-                  </w:pPr>
-                  <w:r>
-                    <w:rPr>
-                      <w:rFonts w:ascii="Arial" w:hAnsi="Arial" w:eastAsia="Arial"/>
-                      <w:b w:val="0"/>
-                      <w:color w:val="565F70"/>
-                      <w:sz w:val="14"/>
-                    </w:rPr>
-                    <w:t>İnsanlarla iletişim kurarken uygulayacağın bir kural yaz.</w:t>
-                  </w:r>
-                </w:p>
-                <w:p>
-                  <w:pPr>
-                    <w:spacing w:before="20" w:after="0"/>
-                  </w:pPr>
-                  <w:r>
-                    <w:rPr>
-                      <w:rFonts w:ascii="Arial" w:hAnsi="Arial" w:eastAsia="Arial"/>
-                      <w:b w:val="0"/>
-                      <w:color w:val="565F70"/>
-                      <w:sz w:val="18"/>
-                    </w:rPr>
-                    <w:t>________________________________________________________</w:t>
-                  </w:r>
-                </w:p>
-                <w:p>
-                  <w:pPr>
-                    <w:spacing w:before="20" w:after="0"/>
-                  </w:pPr>
-                  <w:r>
-                    <w:rPr>
-                      <w:rFonts w:ascii="Arial" w:hAnsi="Arial" w:eastAsia="Arial"/>
-                      <w:b w:val="0"/>
-                      <w:color w:val="565F70"/>
-                      <w:sz w:val="18"/>
-                    </w:rPr>
-                    <w:t>________________________________________________________</w:t>
-                  </w:r>
-                </w:p>
-              </w:tc>
-            </w:tr>
-            <w:tr>
-              <w:trPr>
-                <w:trHeight w:val="1134" w:hRule="exact"/>
-              </w:trPr>
-              <w:tc>
-                <w:tcPr>
-                  <w:tcW w:type="dxa" w:w="3816000"/>
-                  <w:tcMar>
-                    <w:top w:w="75" w:type="dxa"/>
-                    <w:start w:w="95" w:type="dxa"/>
-                    <w:bottom w:w="55" w:type="dxa"/>
-                    <w:end w:w="95" w:type="dxa"/>
-                  </w:tcMar>
-                  <w:tcBorders>
-                    <w:bottom w:val="single" w:sz="6" w:color="DCE1DE"/>
-                  </w:tcBorders>
-                </w:tcPr>
-                <w:p>
-                  <w:pPr>
-                    <w:keepNext/>
-                    <w:spacing w:after="20"/>
-                  </w:pPr>
-                  <w:r>
-                    <w:rPr>
-                      <w:rFonts w:ascii="Arial" w:hAnsi="Arial" w:eastAsia="Arial"/>
-                      <w:b/>
-                      <w:color w:val="12182B"/>
-                      <w:sz w:val="19"/>
-                    </w:rPr>
-                    <w:t>5. Hesabımı korumak için:</w:t>
-                  </w:r>
-                </w:p>
-                <w:p>
-                  <w:pPr>
-                    <w:spacing w:after="40"/>
-                  </w:pPr>
-                  <w:r>
-                    <w:rPr>
-                      <w:rFonts w:ascii="Arial" w:hAnsi="Arial" w:eastAsia="Arial"/>
-                      <w:b w:val="0"/>
-                      <w:color w:val="565F70"/>
-                      <w:sz w:val="14"/>
-                    </w:rPr>
-                    <w:t>Bir güvenlik önlemi yaz.</w:t>
-                  </w:r>
-                </w:p>
-                <w:p>
-                  <w:pPr>
-                    <w:spacing w:before="20" w:after="0"/>
-                  </w:pPr>
-                  <w:r>
-                    <w:rPr>
-                      <w:rFonts w:ascii="Arial" w:hAnsi="Arial" w:eastAsia="Arial"/>
-                      <w:b w:val="0"/>
-                      <w:color w:val="565F70"/>
-                      <w:sz w:val="18"/>
-                    </w:rPr>
-                    <w:t>________________________________________________________</w:t>
-                  </w:r>
-                </w:p>
-              </w:tc>
-            </w:tr>
-          </w:tbl>
-          <w:p/>
-        </w:tc>
-      </w:tr>
-    </w:tbl>
-    <w:p>
-      <w:pPr>
-        <w:widowControl/>
-        <w:spacing w:after="80" w:before="0"/>
-      </w:pPr>
-    </w:p>
-    <w:tbl>
-      <w:tblPr>
-        <w:tblW w:type="auto" w:w="0"/>
-        <w:jc w:val="center"/>
-        <w:tblLayout w:type="fixed"/>
-        <w:tblLook w:firstColumn="1" w:firstRow="1" w:lastColumn="0" w:lastRow="0" w:noHBand="0" w:noVBand="1" w:val="04A0"/>
+        <w:tblBorders>
+          <w:top w:val="single" w:sz="4" w:space="0" w:color="E7DADD"/>
+          <w:left w:val="single" w:sz="4" w:space="0" w:color="E7DADD"/>
+          <w:bottom w:val="single" w:sz="4" w:space="0" w:color="E7DADD"/>
+          <w:right w:val="single" w:sz="4" w:space="0" w:color="E7DADD"/>
+          <w:insideH w:val="single" w:sz="4" w:space="0" w:color="E7DADD"/>
+          <w:insideV w:val="single" w:sz="4" w:space="0" w:color="E7DADD"/>
+        </w:tblBorders>
       </w:tblPr>
       <w:tblGrid>
         <w:gridCol w:w="10376"/>
@@ -683,17 +82,14 @@
       <w:tr>
         <w:tc>
           <w:tcPr>
-            <w:tcW w:type="dxa" w:w="6372000"/>
-            <w:shd w:fill="F8ECEB"/>
+            <w:tcW w:type="dxa" w:w="10376"/>
+            <w:shd w:fill="F8F3F4"/>
             <w:tcMar>
-              <w:top w:w="85" w:type="dxa"/>
-              <w:start w:w="115" w:type="dxa"/>
-              <w:bottom w:w="85" w:type="dxa"/>
-              <w:end w:w="115" w:type="dxa"/>
+              <w:top w:w="100" w:type="dxa"/>
+              <w:start w:w="140" w:type="dxa"/>
+              <w:bottom w:w="100" w:type="dxa"/>
+              <w:end w:w="140" w:type="dxa"/>
             </w:tcMar>
-            <w:tcBorders>
-              <w:start w:val="single" w:sz="14" w:color="8B1E24"/>
-            </w:tcBorders>
           </w:tcPr>
           <w:p>
             <w:pPr>
@@ -703,19 +99,19 @@
               <w:rPr>
                 <w:rFonts w:ascii="Arial" w:hAnsi="Arial" w:eastAsia="Arial"/>
                 <w:b/>
-                <w:color w:val="8B1E24"/>
-                <w:sz w:val="16"/>
+                <w:color w:val="8F2332"/>
+                <w:sz w:val="17"/>
               </w:rPr>
-              <w:t xml:space="preserve">Kişisel bilgi uyarısı: </w:t>
+              <w:t xml:space="preserve">Yönerge  </w:t>
             </w:r>
             <w:r>
               <w:rPr>
                 <w:rFonts w:ascii="Arial" w:hAnsi="Arial" w:eastAsia="Arial"/>
                 <w:b w:val="0"/>
-                <w:color w:val="12182B"/>
-                <w:sz w:val="16"/>
+                <w:color w:val="0E1B2E"/>
+                <w:sz w:val="17"/>
               </w:rPr>
-              <w:t>Bu etkinlikte gerçek adresini, telefon numaranı, okul bilgini veya gerçek şifreni yazma.</w:t>
+              <w:t>Bu çalışma kâğıdı, öğrencilerin çevrim içi kimliklerini somutlaştırarak güvenlik, gizlilik ve dijital vatandaşlık konularını düşünmelerine yardımcı olmak için hazırlanmıştır. Gerçek bilgiler yerine hayali/simgesel bilgiler yazınız.</w:t>
             </w:r>
           </w:p>
         </w:tc>
@@ -723,18 +119,8 @@
     </w:tbl>
     <w:p>
       <w:pPr>
-        <w:widowControl/>
-        <w:spacing w:before="100" w:after="60"/>
+        <w:spacing w:after="0"/>
       </w:pPr>
-      <w:r>
-        <w:rPr>
-          <w:rFonts w:ascii="Arial" w:hAnsi="Arial" w:eastAsia="Arial"/>
-          <w:b/>
-          <w:color w:val="12182B"/>
-          <w:sz w:val="22"/>
-        </w:rPr>
-        <w:t>Kartımı kontrol ediyorum</w:t>
-      </w:r>
     </w:p>
     <w:tbl>
       <w:tblPr>
@@ -742,145 +128,176 @@
         <w:jc w:val="center"/>
         <w:tblLayout w:type="fixed"/>
         <w:tblLook w:firstColumn="1" w:firstRow="1" w:lastColumn="0" w:lastRow="0" w:noHBand="0" w:noVBand="1" w:val="04A0"/>
+        <w:tblBorders>
+          <w:top w:val="single" w:sz="6" w:space="0" w:color="D8DDE6"/>
+          <w:left w:val="single" w:sz="6" w:space="0" w:color="D8DDE6"/>
+          <w:bottom w:val="single" w:sz="6" w:space="0" w:color="D8DDE6"/>
+          <w:right w:val="single" w:sz="6" w:space="0" w:color="D8DDE6"/>
+          <w:insideH w:val="single" w:sz="6" w:space="0" w:color="D8DDE6"/>
+          <w:insideV w:val="single" w:sz="6" w:space="0" w:color="D8DDE6"/>
+        </w:tblBorders>
       </w:tblPr>
       <w:tblGrid>
-        <w:gridCol w:w="5188"/>
-        <w:gridCol w:w="5188"/>
+        <w:gridCol w:w="3402"/>
+        <w:gridCol w:w="6973"/>
       </w:tblGrid>
       <w:tr>
-        <w:trPr>
-          <w:trHeight w:val="935" w:hRule="exact"/>
-        </w:trPr>
         <w:tc>
           <w:tcPr>
-            <w:tcW w:type="dxa" w:w="3186000"/>
+            <w:tcW w:type="dxa" w:w="5188"/>
+            <w:shd w:fill="FFFFFF"/>
             <w:tcMar>
-              <w:top w:w="120" w:type="dxa"/>
-              <w:start w:w="110" w:type="dxa"/>
-              <w:bottom w:w="110" w:type="dxa"/>
-              <w:end w:w="110" w:type="dxa"/>
+              <w:top w:w="130" w:type="dxa"/>
+              <w:start w:w="140" w:type="dxa"/>
+              <w:bottom w:w="130" w:type="dxa"/>
+              <w:end w:w="140" w:type="dxa"/>
             </w:tcMar>
-            <w:tcBorders>
-              <w:top w:val="single" w:sz="6" w:color="DCE1DE"/>
-              <w:bottom w:val="single" w:sz="6" w:color="DCE1DE"/>
-              <w:start w:val="single" w:sz="6" w:color="DCE1DE"/>
-              <w:end w:val="single" w:sz="6" w:color="DCE1DE"/>
-            </w:tcBorders>
-            <w:vAlign w:val="center"/>
           </w:tcPr>
           <w:p>
             <w:pPr>
-              <w:spacing w:after="0"/>
+              <w:spacing w:after="40"/>
+            </w:pPr>
+            <w:r>
+              <w:rPr>
+                <w:rFonts w:ascii="Arial" w:hAnsi="Arial" w:eastAsia="Arial"/>
+                <w:b/>
+                <w:color w:val="0E1B2E"/>
+                <w:sz w:val="18"/>
+              </w:rPr>
+              <w:t>Profil Resmi</w:t>
+            </w:r>
+            <w:r>
+              <w:rPr>
+                <w:rFonts w:ascii="Arial" w:hAnsi="Arial" w:eastAsia="Arial"/>
+                <w:b w:val="0"/>
+                <w:color w:val="667085"/>
+                <w:sz w:val="15"/>
+              </w:rPr>
+              <w:t xml:space="preserve">  Çiz / simgesel görsel</w:t>
+            </w:r>
+          </w:p>
+          <w:p>
+            <w:pPr>
+              <w:spacing w:after="20"/>
             </w:pPr>
             <w:r>
               <w:rPr>
                 <w:rFonts w:ascii="Arial" w:hAnsi="Arial" w:eastAsia="Arial"/>
                 <w:b w:val="0"/>
-                <w:color w:val="12182B"/>
-                <w:sz w:val="17"/>
+                <w:color w:val="A3A9B4"/>
+                <w:sz w:val="16"/>
               </w:rPr>
-              <w:t>□  Kullanıcı adım kişisel bilgilerimi gereksiz yere açıklamıyor.</w:t>
+              <w:t>................................................................................................</w:t>
+            </w:r>
+          </w:p>
+          <w:p>
+            <w:pPr>
+              <w:spacing w:after="20"/>
+            </w:pPr>
+            <w:r>
+              <w:rPr>
+                <w:rFonts w:ascii="Arial" w:hAnsi="Arial" w:eastAsia="Arial"/>
+                <w:b w:val="0"/>
+                <w:color w:val="A3A9B4"/>
+                <w:sz w:val="16"/>
+              </w:rPr>
+              <w:t>................................................................................................</w:t>
+            </w:r>
+          </w:p>
+          <w:p>
+            <w:pPr>
+              <w:spacing w:after="20"/>
+            </w:pPr>
+            <w:r>
+              <w:rPr>
+                <w:rFonts w:ascii="Arial" w:hAnsi="Arial" w:eastAsia="Arial"/>
+                <w:b w:val="0"/>
+                <w:color w:val="A3A9B4"/>
+                <w:sz w:val="16"/>
+              </w:rPr>
+              <w:t>................................................................................................</w:t>
+            </w:r>
+          </w:p>
+          <w:p>
+            <w:pPr>
+              <w:spacing w:after="20"/>
+            </w:pPr>
+            <w:r>
+              <w:rPr>
+                <w:rFonts w:ascii="Arial" w:hAnsi="Arial" w:eastAsia="Arial"/>
+                <w:b w:val="0"/>
+                <w:color w:val="A3A9B4"/>
+                <w:sz w:val="16"/>
+              </w:rPr>
+              <w:t>................................................................................................</w:t>
+            </w:r>
+          </w:p>
+          <w:p>
+            <w:pPr>
+              <w:spacing w:after="20"/>
+            </w:pPr>
+            <w:r>
+              <w:rPr>
+                <w:rFonts w:ascii="Arial" w:hAnsi="Arial" w:eastAsia="Arial"/>
+                <w:b w:val="0"/>
+                <w:color w:val="A3A9B4"/>
+                <w:sz w:val="16"/>
+              </w:rPr>
+              <w:t>................................................................................................</w:t>
             </w:r>
           </w:p>
         </w:tc>
         <w:tc>
           <w:tcPr>
-            <w:tcW w:type="dxa" w:w="3186000"/>
+            <w:tcW w:type="dxa" w:w="5188"/>
+            <w:shd w:fill="FFFFFF"/>
             <w:tcMar>
-              <w:top w:w="120" w:type="dxa"/>
-              <w:start w:w="110" w:type="dxa"/>
-              <w:bottom w:w="110" w:type="dxa"/>
-              <w:end w:w="110" w:type="dxa"/>
+              <w:top w:w="130" w:type="dxa"/>
+              <w:start w:w="140" w:type="dxa"/>
+              <w:bottom w:w="130" w:type="dxa"/>
+              <w:end w:w="140" w:type="dxa"/>
             </w:tcMar>
-            <w:tcBorders>
-              <w:top w:val="single" w:sz="6" w:color="DCE1DE"/>
-              <w:bottom w:val="single" w:sz="6" w:color="DCE1DE"/>
-              <w:start w:val="single" w:sz="6" w:color="DCE1DE"/>
-              <w:end w:val="single" w:sz="6" w:color="DCE1DE"/>
-            </w:tcBorders>
-            <w:vAlign w:val="center"/>
           </w:tcPr>
           <w:p>
             <w:pPr>
-              <w:spacing w:after="0"/>
+              <w:spacing w:after="40"/>
+            </w:pPr>
+            <w:r>
+              <w:rPr>
+                <w:rFonts w:ascii="Arial" w:hAnsi="Arial" w:eastAsia="Arial"/>
+                <w:b/>
+                <w:color w:val="0E1B2E"/>
+                <w:sz w:val="18"/>
+              </w:rPr>
+              <w:t>Kullanıcı Adı</w:t>
+            </w:r>
+          </w:p>
+          <w:p>
+            <w:pPr>
+              <w:spacing w:after="20"/>
             </w:pPr>
             <w:r>
               <w:rPr>
                 <w:rFonts w:ascii="Arial" w:hAnsi="Arial" w:eastAsia="Arial"/>
                 <w:b w:val="0"/>
-                <w:color w:val="12182B"/>
-                <w:sz w:val="17"/>
+                <w:color w:val="A3A9B4"/>
+                <w:sz w:val="16"/>
               </w:rPr>
-              <w:t>□  Hangi bilgilerimi paylaşmayacağımı düşündüm.</w:t>
+              <w:t>................................................................................................</w:t>
             </w:r>
           </w:p>
-        </w:tc>
-      </w:tr>
-      <w:tr>
-        <w:trPr>
-          <w:trHeight w:val="935" w:hRule="exact"/>
-        </w:trPr>
-        <w:tc>
-          <w:tcPr>
-            <w:tcW w:type="dxa" w:w="3186000"/>
-            <w:tcMar>
-              <w:top w:w="120" w:type="dxa"/>
-              <w:start w:w="110" w:type="dxa"/>
-              <w:bottom w:w="110" w:type="dxa"/>
-              <w:end w:w="110" w:type="dxa"/>
-            </w:tcMar>
-            <w:tcBorders>
-              <w:top w:val="single" w:sz="6" w:color="DCE1DE"/>
-              <w:bottom w:val="single" w:sz="6" w:color="DCE1DE"/>
-              <w:start w:val="single" w:sz="6" w:color="DCE1DE"/>
-              <w:end w:val="single" w:sz="6" w:color="DCE1DE"/>
-            </w:tcBorders>
-            <w:vAlign w:val="center"/>
-          </w:tcPr>
           <w:p>
             <w:pPr>
-              <w:spacing w:after="0"/>
+              <w:spacing w:after="20"/>
             </w:pPr>
             <w:r>
               <w:rPr>
                 <w:rFonts w:ascii="Arial" w:hAnsi="Arial" w:eastAsia="Arial"/>
                 <w:b w:val="0"/>
-                <w:color w:val="12182B"/>
-                <w:sz w:val="17"/>
+                <w:color w:val="A3A9B4"/>
+                <w:sz w:val="16"/>
               </w:rPr>
-              <w:t>□  Bir çevrim içi davranış kuralı belirledim.</w:t>
-            </w:r>
-          </w:p>
-        </w:tc>
-        <w:tc>
-          <w:tcPr>
-            <w:tcW w:type="dxa" w:w="3186000"/>
-            <w:tcMar>
-              <w:top w:w="120" w:type="dxa"/>
-              <w:start w:w="110" w:type="dxa"/>
-              <w:bottom w:w="110" w:type="dxa"/>
-              <w:end w:w="110" w:type="dxa"/>
-            </w:tcMar>
-            <w:tcBorders>
-              <w:top w:val="single" w:sz="6" w:color="DCE1DE"/>
-              <w:bottom w:val="single" w:sz="6" w:color="DCE1DE"/>
-              <w:start w:val="single" w:sz="6" w:color="DCE1DE"/>
-              <w:end w:val="single" w:sz="6" w:color="DCE1DE"/>
-            </w:tcBorders>
-            <w:vAlign w:val="center"/>
-          </w:tcPr>
-          <w:p>
-            <w:pPr>
-              <w:spacing w:after="0"/>
-            </w:pPr>
-            <w:r>
-              <w:rPr>
-                <w:rFonts w:ascii="Arial" w:hAnsi="Arial" w:eastAsia="Arial"/>
-                <w:b w:val="0"/>
-                <w:color w:val="12182B"/>
-                <w:sz w:val="17"/>
-              </w:rPr>
-              <w:t>□  Hesabımı korumak için bir önlem düşündüm.</w:t>
+              <w:t>................................................................................................</w:t>
             </w:r>
           </w:p>
         </w:tc>
@@ -888,25 +305,341 @@
     </w:tbl>
     <w:p>
       <w:pPr>
-        <w:widowControl/>
-        <w:spacing w:before="100" w:after="0"/>
-        <w:jc w:val="left"/>
+        <w:spacing w:after="0"/>
       </w:pPr>
-      <w:r>
-        <w:rPr>
-          <w:rFonts w:ascii="Arial" w:hAnsi="Arial" w:eastAsia="Arial"/>
-          <w:b w:val="0"/>
-          <w:color w:val="565F70"/>
-          <w:sz w:val="15"/>
-        </w:rPr>
-        <w:t>Kartını bitirdiğinde bir maddeyi değiştirmek istersen, düzeltip yeniden kontrol et.</w:t>
-      </w:r>
     </w:p>
+    <w:tbl>
+      <w:tblPr>
+        <w:tblW w:type="auto" w:w="0"/>
+        <w:jc w:val="center"/>
+        <w:tblLayout w:type="fixed"/>
+        <w:tblLook w:firstColumn="1" w:firstRow="1" w:lastColumn="0" w:lastRow="0" w:noHBand="0" w:noVBand="1" w:val="04A0"/>
+        <w:tblBorders>
+          <w:top w:val="single" w:sz="6" w:space="0" w:color="D8DDE6"/>
+          <w:left w:val="single" w:sz="6" w:space="0" w:color="D8DDE6"/>
+          <w:bottom w:val="single" w:sz="6" w:space="0" w:color="D8DDE6"/>
+          <w:right w:val="single" w:sz="6" w:space="0" w:color="D8DDE6"/>
+          <w:insideH w:val="single" w:sz="6" w:space="0" w:color="D8DDE6"/>
+          <w:insideV w:val="single" w:sz="6" w:space="0" w:color="D8DDE6"/>
+        </w:tblBorders>
+      </w:tblPr>
+      <w:tblGrid>
+        <w:gridCol w:w="5188"/>
+        <w:gridCol w:w="5188"/>
+      </w:tblGrid>
+      <w:tr>
+        <w:tc>
+          <w:tcPr>
+            <w:tcW w:type="dxa" w:w="5188"/>
+            <w:tcMar>
+              <w:top w:w="110" w:type="dxa"/>
+              <w:start w:w="130" w:type="dxa"/>
+              <w:bottom w:w="110" w:type="dxa"/>
+              <w:end w:w="130" w:type="dxa"/>
+            </w:tcMar>
+            <w:shd w:fill="EDF2F7"/>
+          </w:tcPr>
+          <w:p>
+            <w:pPr>
+              <w:spacing w:after="40"/>
+            </w:pPr>
+            <w:r>
+              <w:rPr>
+                <w:rFonts w:ascii="Arial" w:hAnsi="Arial" w:eastAsia="Arial"/>
+                <w:b/>
+                <w:color w:val="0E1B2E"/>
+                <w:sz w:val="18"/>
+              </w:rPr>
+              <w:t>Profil Bilgileri</w:t>
+            </w:r>
+            <w:r>
+              <w:rPr>
+                <w:rFonts w:ascii="Arial" w:hAnsi="Arial" w:eastAsia="Arial"/>
+                <w:b w:val="0"/>
+                <w:color w:val="667085"/>
+                <w:sz w:val="15"/>
+              </w:rPr>
+              <w:t xml:space="preserve">  İlgi Alanlarım / Hakkımda Kısa Not</w:t>
+            </w:r>
+          </w:p>
+          <w:p>
+            <w:pPr>
+              <w:spacing w:after="20"/>
+            </w:pPr>
+            <w:r>
+              <w:rPr>
+                <w:rFonts w:ascii="Arial" w:hAnsi="Arial" w:eastAsia="Arial"/>
+                <w:b w:val="0"/>
+                <w:color w:val="A3A9B4"/>
+                <w:sz w:val="16"/>
+              </w:rPr>
+              <w:t>................................................................................................</w:t>
+            </w:r>
+          </w:p>
+          <w:p>
+            <w:pPr>
+              <w:spacing w:after="20"/>
+            </w:pPr>
+            <w:r>
+              <w:rPr>
+                <w:rFonts w:ascii="Arial" w:hAnsi="Arial" w:eastAsia="Arial"/>
+                <w:b w:val="0"/>
+                <w:color w:val="A3A9B4"/>
+                <w:sz w:val="16"/>
+              </w:rPr>
+              <w:t>................................................................................................</w:t>
+            </w:r>
+          </w:p>
+          <w:p>
+            <w:pPr>
+              <w:spacing w:after="20"/>
+            </w:pPr>
+            <w:r>
+              <w:rPr>
+                <w:rFonts w:ascii="Arial" w:hAnsi="Arial" w:eastAsia="Arial"/>
+                <w:b w:val="0"/>
+                <w:color w:val="A3A9B4"/>
+                <w:sz w:val="16"/>
+              </w:rPr>
+              <w:t>................................................................................................</w:t>
+            </w:r>
+          </w:p>
+        </w:tc>
+        <w:tc>
+          <w:tcPr>
+            <w:tcW w:type="dxa" w:w="5188"/>
+            <w:tcMar>
+              <w:top w:w="110" w:type="dxa"/>
+              <w:start w:w="130" w:type="dxa"/>
+              <w:bottom w:w="110" w:type="dxa"/>
+              <w:end w:w="130" w:type="dxa"/>
+            </w:tcMar>
+            <w:shd w:fill="F5EEF5"/>
+          </w:tcPr>
+          <w:p>
+            <w:r>
+              <w:rPr>
+                <w:rFonts w:ascii="Arial" w:hAnsi="Arial" w:eastAsia="Arial"/>
+                <w:b/>
+                <w:color w:val="0E1B2E"/>
+                <w:sz w:val="18"/>
+              </w:rPr>
+              <w:t>Gizlilik Ayarları</w:t>
+            </w:r>
+          </w:p>
+          <w:p>
+            <w:pPr>
+              <w:spacing w:after="60"/>
+            </w:pPr>
+            <w:r>
+              <w:rPr>
+                <w:rFonts w:ascii="Arial" w:hAnsi="Arial" w:eastAsia="Arial"/>
+                <w:b w:val="0"/>
+                <w:color w:val="0E1B2E"/>
+                <w:sz w:val="17"/>
+              </w:rPr>
+              <w:t>Profilim kimlere görünür?   ☐ Herkes   ☐ Sadece arkadaşlar   ☐ Gizli</w:t>
+            </w:r>
+          </w:p>
+          <w:p>
+            <w:pPr>
+              <w:spacing w:after="60"/>
+            </w:pPr>
+            <w:r>
+              <w:rPr>
+                <w:rFonts w:ascii="Arial" w:hAnsi="Arial" w:eastAsia="Arial"/>
+                <w:b w:val="0"/>
+                <w:color w:val="0E1B2E"/>
+                <w:sz w:val="17"/>
+              </w:rPr>
+              <w:t>Paylaşımlarımı kimler görebilir?   ☐ Herkes   ☐ Arkadaşlarım</w:t>
+            </w:r>
+          </w:p>
+        </w:tc>
+      </w:tr>
+      <w:tr>
+        <w:tc>
+          <w:tcPr>
+            <w:tcW w:type="dxa" w:w="5188"/>
+            <w:tcMar>
+              <w:top w:w="110" w:type="dxa"/>
+              <w:start w:w="130" w:type="dxa"/>
+              <w:bottom w:w="110" w:type="dxa"/>
+              <w:end w:w="130" w:type="dxa"/>
+            </w:tcMar>
+            <w:shd w:fill="EEF6F2"/>
+          </w:tcPr>
+          <w:p>
+            <w:pPr>
+              <w:spacing w:after="40"/>
+            </w:pPr>
+            <w:r>
+              <w:rPr>
+                <w:rFonts w:ascii="Arial" w:hAnsi="Arial" w:eastAsia="Arial"/>
+                <w:b/>
+                <w:color w:val="0E1B2E"/>
+                <w:sz w:val="18"/>
+              </w:rPr>
+              <w:t>Güçlü Şifre Örneğim</w:t>
+            </w:r>
+          </w:p>
+          <w:p>
+            <w:pPr>
+              <w:spacing w:after="20"/>
+            </w:pPr>
+            <w:r>
+              <w:rPr>
+                <w:rFonts w:ascii="Arial" w:hAnsi="Arial" w:eastAsia="Arial"/>
+                <w:b w:val="0"/>
+                <w:color w:val="A3A9B4"/>
+                <w:sz w:val="16"/>
+              </w:rPr>
+              <w:t>................................................................................................</w:t>
+            </w:r>
+          </w:p>
+          <w:p>
+            <w:pPr>
+              <w:spacing w:after="20"/>
+            </w:pPr>
+            <w:r>
+              <w:rPr>
+                <w:rFonts w:ascii="Arial" w:hAnsi="Arial" w:eastAsia="Arial"/>
+                <w:b w:val="0"/>
+                <w:color w:val="A3A9B4"/>
+                <w:sz w:val="16"/>
+              </w:rPr>
+              <w:t>................................................................................................</w:t>
+            </w:r>
+          </w:p>
+        </w:tc>
+        <w:tc>
+          <w:tcPr>
+            <w:tcW w:type="dxa" w:w="5188"/>
+            <w:tcMar>
+              <w:top w:w="110" w:type="dxa"/>
+              <w:start w:w="130" w:type="dxa"/>
+              <w:bottom w:w="110" w:type="dxa"/>
+              <w:end w:w="130" w:type="dxa"/>
+            </w:tcMar>
+            <w:shd w:fill="FBF3E7"/>
+          </w:tcPr>
+          <w:p>
+            <w:pPr>
+              <w:spacing w:after="40"/>
+            </w:pPr>
+            <w:r>
+              <w:rPr>
+                <w:rFonts w:ascii="Arial" w:hAnsi="Arial" w:eastAsia="Arial"/>
+                <w:b/>
+                <w:color w:val="0E1B2E"/>
+                <w:sz w:val="18"/>
+              </w:rPr>
+              <w:t>Çevrim İçi Davranış Kurallarım</w:t>
+            </w:r>
+            <w:r>
+              <w:rPr>
+                <w:rFonts w:ascii="Arial" w:hAnsi="Arial" w:eastAsia="Arial"/>
+                <w:b w:val="0"/>
+                <w:color w:val="667085"/>
+                <w:sz w:val="15"/>
+              </w:rPr>
+              <w:t xml:space="preserve">  1) / 2)</w:t>
+            </w:r>
+          </w:p>
+          <w:p>
+            <w:pPr>
+              <w:spacing w:after="20"/>
+            </w:pPr>
+            <w:r>
+              <w:rPr>
+                <w:rFonts w:ascii="Arial" w:hAnsi="Arial" w:eastAsia="Arial"/>
+                <w:b w:val="0"/>
+                <w:color w:val="A3A9B4"/>
+                <w:sz w:val="16"/>
+              </w:rPr>
+              <w:t>................................................................................................</w:t>
+            </w:r>
+          </w:p>
+          <w:p>
+            <w:pPr>
+              <w:spacing w:after="20"/>
+            </w:pPr>
+            <w:r>
+              <w:rPr>
+                <w:rFonts w:ascii="Arial" w:hAnsi="Arial" w:eastAsia="Arial"/>
+                <w:b w:val="0"/>
+                <w:color w:val="A3A9B4"/>
+                <w:sz w:val="16"/>
+              </w:rPr>
+              <w:t>................................................................................................</w:t>
+            </w:r>
+          </w:p>
+        </w:tc>
+      </w:tr>
+    </w:tbl>
+    <w:p>
+      <w:pPr>
+        <w:spacing w:after="20"/>
+      </w:pPr>
+    </w:p>
+    <w:tbl>
+      <w:tblPr>
+        <w:tblW w:type="auto" w:w="0"/>
+        <w:tblLook w:firstColumn="1" w:firstRow="1" w:lastColumn="0" w:lastRow="0" w:noHBand="0" w:noVBand="1" w:val="04A0"/>
+        <w:tblBorders>
+          <w:top w:val="single" w:sz="6" w:space="0" w:color="D8DDE6"/>
+          <w:left w:val="single" w:sz="6" w:space="0" w:color="D8DDE6"/>
+          <w:bottom w:val="single" w:sz="6" w:space="0" w:color="D8DDE6"/>
+          <w:right w:val="single" w:sz="6" w:space="0" w:color="D8DDE6"/>
+          <w:insideH w:val="single" w:sz="6" w:space="0" w:color="D8DDE6"/>
+          <w:insideV w:val="single" w:sz="6" w:space="0" w:color="D8DDE6"/>
+        </w:tblBorders>
+      </w:tblPr>
+      <w:tblGrid>
+        <w:gridCol w:w="10376"/>
+      </w:tblGrid>
+      <w:tr>
+        <w:tc>
+          <w:tcPr>
+            <w:tcW w:type="dxa" w:w="10376"/>
+            <w:shd w:fill="F8F9FB"/>
+            <w:tcMar>
+              <w:top w:w="110" w:type="dxa"/>
+              <w:start w:w="140" w:type="dxa"/>
+              <w:bottom w:w="110" w:type="dxa"/>
+              <w:end w:w="140" w:type="dxa"/>
+            </w:tcMar>
+          </w:tcPr>
+          <w:p>
+            <w:r>
+              <w:rPr>
+                <w:rFonts w:ascii="Arial" w:hAnsi="Arial" w:eastAsia="Arial"/>
+                <w:b/>
+                <w:color w:val="0E1B2E"/>
+                <w:sz w:val="19"/>
+              </w:rPr>
+              <w:t>Dijital Kimliğim Nerelerde Etkilidir?</w:t>
+            </w:r>
+          </w:p>
+          <w:p>
+            <w:r>
+              <w:rPr>
+                <w:rFonts w:ascii="Arial" w:hAnsi="Arial" w:eastAsia="Arial"/>
+                <w:b w:val="0"/>
+                <w:color w:val="0E1B2E"/>
+                <w:sz w:val="17"/>
+              </w:rPr>
+              <w:t>☐ Sosyal medya      ☐ Oyun platformları      ☐ E-posta / okul hesapları      ☐ Başka: ...........................................</w:t>
+            </w:r>
+          </w:p>
+        </w:tc>
+      </w:tr>
+    </w:tbl>
     <w:sectPr>
       <w:headerReference w:type="default" r:id="rId9"/>
       <w:footerReference w:type="default" r:id="rId10"/>
       <w:pgSz w:w="11906" w:h="16838"/>
-      <w:pgMar w:top="709" w:right="765" w:bottom="680" w:left="765" w:header="340" w:footer="312" w:gutter="0"/>
+      <w:pgMar w:top="709" w:right="765" w:bottom="680" w:left="765" w:header="720" w:footer="720" w:gutter="0"/>
       <w:cols w:space="720"/>
       <w:docGrid w:linePitch="360"/>
     </w:sectPr>
@@ -925,10 +658,10 @@
       <w:rPr>
         <w:rFonts w:ascii="Arial" w:hAnsi="Arial" w:eastAsia="Arial"/>
         <w:b w:val="0"/>
-        <w:color w:val="565F70"/>
+        <w:color w:val="667085"/>
         <w:sz w:val="14"/>
       </w:rPr>
-      <w:t>KeskinLab · Türkiye Yüzyılı Maarif Modeli uyumlu ders materyali</w:t>
+      <w:t>KeskinLab • Öğrenmeyi Tasarla</w:t>
     </w:r>
   </w:p>
 </w:ftr>
@@ -936,80 +669,20 @@
 
 <file path=word/header1.xml><?xml version="1.0" encoding="utf-8"?>
 <w:hdr xmlns:m="http://schemas.openxmlformats.org/officeDocument/2006/math" xmlns:mc="http://schemas.openxmlformats.org/markup-compatibility/2006" xmlns:mo="http://schemas.microsoft.com/office/mac/office/2008/main" xmlns:mv="urn:schemas-microsoft-com:mac:vml" xmlns:o="urn:schemas-microsoft-com:office:office" xmlns:r="http://schemas.openxmlformats.org/officeDocument/2006/relationships" xmlns:v="urn:schemas-microsoft-com:vml" xmlns:w10="urn:schemas-microsoft-com:office:word" xmlns:w14="http://schemas.microsoft.com/office/word/2010/wordml" xmlns:w="http://schemas.openxmlformats.org/wordprocessingml/2006/main" xmlns:wne="http://schemas.microsoft.com/office/word/2006/wordml" xmlns:wp14="http://schemas.microsoft.com/office/word/2010/wordprocessingDrawing" xmlns:wp="http://schemas.openxmlformats.org/drawingml/2006/wordprocessingDrawing" xmlns:wpc="http://schemas.microsoft.com/office/word/2010/wordprocessingCanvas" xmlns:wpg="http://schemas.microsoft.com/office/word/2010/wordprocessingGroup" xmlns:wpi="http://schemas.microsoft.com/office/word/2010/wordprocessingInk" xmlns:wps="http://schemas.microsoft.com/office/word/2010/wordprocessingShape" mc:Ignorable="w14 wp14">
-  <w:tbl>
-    <w:tblPr>
-      <w:tblW w:type="auto" w:w="0"/>
-      <w:jc w:val="center"/>
-      <w:tblLayout w:type="fixed"/>
-      <w:tblLook w:firstColumn="1" w:firstRow="1" w:lastColumn="0" w:lastRow="0" w:noHBand="0" w:noVBand="1" w:val="04A0"/>
-    </w:tblPr>
-    <w:tblGrid>
-      <w:gridCol w:w="5187"/>
-      <w:gridCol w:w="5187"/>
-    </w:tblGrid>
-    <w:tr>
-      <w:tc>
-        <w:tcPr>
-          <w:tcW w:type="dxa" w:w="5187"/>
-          <w:tcMar>
-            <w:top w:w="0" w:type="dxa"/>
-            <w:start w:w="0" w:type="dxa"/>
-            <w:bottom w:w="45" w:type="dxa"/>
-            <w:end w:w="0" w:type="dxa"/>
-          </w:tcMar>
-          <w:tcBorders>
-            <w:bottom w:val="single" w:sz="10" w:space="4" w:color="8B1E24"/>
-          </w:tcBorders>
-        </w:tcPr>
-        <w:p>
-          <w:pPr>
-            <w:jc w:val="left"/>
-          </w:pPr>
-          <w:r>
-            <w:rPr>
-              <w:rFonts w:ascii="Arial" w:hAnsi="Arial" w:eastAsia="Arial"/>
-              <w:b/>
-              <w:color w:val="12182B"/>
-              <w:sz w:val="17"/>
-            </w:rPr>
-            <w:t>5. SINIF BTY   ·   HAFTA 03</w:t>
-          </w:r>
-        </w:p>
-      </w:tc>
-      <w:tc>
-        <w:tcPr>
-          <w:tcW w:type="dxa" w:w="5187"/>
-          <w:tcMar>
-            <w:top w:w="0" w:type="dxa"/>
-            <w:start w:w="0" w:type="dxa"/>
-            <w:bottom w:w="45" w:type="dxa"/>
-            <w:end w:w="0" w:type="dxa"/>
-          </w:tcMar>
-          <w:tcBorders>
-            <w:bottom w:val="single" w:sz="10" w:space="4" w:color="8B1E24"/>
-          </w:tcBorders>
-        </w:tcPr>
-        <w:p>
-          <w:pPr>
-            <w:jc w:val="right"/>
-          </w:pPr>
-          <w:r>
-            <w:rPr>
-              <w:rFonts w:ascii="Arial" w:hAnsi="Arial" w:eastAsia="Arial"/>
-              <w:b/>
-              <w:color w:val="8B1E24"/>
-              <w:sz w:val="17"/>
-            </w:rPr>
-            <w:t>KeskinLab</w:t>
-          </w:r>
-        </w:p>
-      </w:tc>
-    </w:tr>
-  </w:tbl>
   <w:p>
     <w:pPr>
-      <w:spacing w:after="0" w:before="0" w:line="24" w:lineRule="auto"/>
-    </w:pPr>
+      <w:pStyle w:val="Header"/>
+      <w:jc w:val="right"/>
+    </w:pPr>
+    <w:r>
+      <w:rPr>
+        <w:rFonts w:ascii="Arial" w:hAnsi="Arial" w:eastAsia="Arial"/>
+        <w:b/>
+        <w:color w:val="8F2332"/>
+        <w:sz w:val="15"/>
+      </w:rPr>
+      <w:t>KESKİNLAB  •  5. SINIF BTY  •  HAFTA 03</w:t>
+    </w:r>
   </w:p>
 </w:hdr>
 </file>
@@ -1377,11 +1050,6 @@
     <w:name w:val="Normal"/>
     <w:qFormat/>
     <w:rsid w:val="00FC693F"/>
-    <w:rPr>
-      <w:rFonts w:ascii="Arial" w:hAnsi="Arial" w:eastAsia="Arial"/>
-      <w:color w:val="12182B"/>
-      <w:sz w:val="19"/>
-    </w:rPr>
   </w:style>
   <w:style w:type="paragraph" w:styleId="Header">
     <w:name w:val="header"/>

</xml_diff>